<commit_message>
v6.6.5.2: smart word import, unified workbench, quick edit, command palette, machine checks
</commit_message>
<xml_diff>
--- a/templates/question-import-khtn.docx
+++ b/templates/question-import-khtn.docx
@@ -12,33 +12,59 @@
           <w:szCs w:val="24"/>
           <w:rFonts w:ascii="Lexend" w:cs="Lexend" w:eastAsia="Lexend" w:hAnsi="Lexend"/>
         </w:rPr>
-        <w:t xml:space="preserve">MẪU CẤU TRÚC NHẬP — THAY BẰNG CÂU HỎI ĐÃ ĐƯỢC NHÀ TRƯỜNG DUYỆT</w:t>
-      </w:r>
-    </w:p>
-    <w:p>
-      <w:pPr>
-        <w:spacing w:after="120"/>
-      </w:pPr>
-      <w:r>
-        <w:rPr>
-          <w:sz w:val="24"/>
-          <w:szCs w:val="24"/>
-          <w:rFonts w:ascii="Lexend" w:cs="Lexend" w:eastAsia="Lexend" w:hAnsi="Lexend"/>
-        </w:rPr>
-        <w:t xml:space="preserve">Mã Outcome/YCCĐ bên dưới là ví dụ cấu trúc, không phải dữ liệu chương trình chính thức.</w:t>
-      </w:r>
-    </w:p>
-    <w:p>
-      <w:pPr>
-        <w:spacing w:after="120"/>
-      </w:pPr>
-      <w:r>
-        <w:rPr>
-          <w:sz w:val="24"/>
-          <w:szCs w:val="24"/>
-          <w:rFonts w:ascii="Lexend" w:cs="Lexend" w:eastAsia="Lexend" w:hAnsi="Lexend"/>
-        </w:rPr>
-        <w:t xml:space="preserve">Chọn đúng môn, khối, chuyên đề trong bước xem trước. Không tự điền mức độ khi chưa xác định.</w:t>
+        <w:t xml:space="preserve">MẪU WORD NHẬP CÂU HỎI — THAY CÁC CÂU VÍ DỤ BẰNG CÂU HỎI THẬT</w:t>
+      </w:r>
+    </w:p>
+    <w:p>
+      <w:pPr>
+        <w:spacing w:after="120"/>
+      </w:pPr>
+      <w:r>
+        <w:rPr>
+          <w:sz w:val="24"/>
+          <w:szCs w:val="24"/>
+          <w:rFonts w:ascii="Lexend" w:cs="Lexend" w:eastAsia="Lexend" w:hAnsi="Lexend"/>
+        </w:rPr>
+        <w:t xml:space="preserve">Mã Outcome/YCCĐ trong ví dụ chỉ minh họa cấu trúc, không phải dữ liệu chương trình chính thức.</w:t>
+      </w:r>
+    </w:p>
+    <w:p>
+      <w:pPr>
+        <w:spacing w:after="120"/>
+      </w:pPr>
+      <w:r>
+        <w:rPr>
+          <w:sz w:val="24"/>
+          <w:szCs w:val="24"/>
+          <w:rFonts w:ascii="Lexend" w:cs="Lexend" w:eastAsia="Lexend" w:hAnsi="Lexend"/>
+        </w:rPr>
+        <w:t xml:space="preserve">Mã câu: Câu &lt;Phân môn L/H/S&gt;. &lt;Outcome&gt;. &lt;YCCĐ&gt;. &lt;Mức NB/TH/VD/VDC&gt;. &lt;Số&gt;. &lt;Dạng TN/ĐS/TLN/GN/TL&gt;. Khối KHÔNG ghi trong mã.</w:t>
+      </w:r>
+    </w:p>
+    <w:p>
+      <w:pPr>
+        <w:spacing w:after="120"/>
+      </w:pPr>
+      <w:r>
+        <w:rPr>
+          <w:sz w:val="24"/>
+          <w:szCs w:val="24"/>
+          <w:rFonts w:ascii="Lexend" w:cs="Lexend" w:eastAsia="Lexend" w:hAnsi="Lexend"/>
+        </w:rPr>
+        <w:t xml:space="preserve">Khi tải lên chỉ cần chọn Môn và Khối. Hệ thống tự đọc Outcome, YCCĐ, mức, dạng từ mã và tự gắn Bài nếu dữ liệu nền đã liên kết.</w:t>
+      </w:r>
+    </w:p>
+    <w:p>
+      <w:pPr>
+        <w:spacing w:after="120"/>
+      </w:pPr>
+      <w:r>
+        <w:rPr>
+          <w:sz w:val="24"/>
+          <w:szCs w:val="24"/>
+          <w:rFonts w:ascii="Lexend" w:cs="Lexend" w:eastAsia="Lexend" w:hAnsi="Lexend"/>
+        </w:rPr>
+        <w:t xml:space="preserve">(Tùy chọn) Có thể thêm một dòng đầu tệp dạng “Bài: tên bài” để hệ thống đối chiếu; mã câu vẫn được ưu tiên.</w:t>
       </w:r>
     </w:p>
     <w:p>

</xml_diff>